<commit_message>
Correct Dental Muller market age from 40 to 30 years.
Update the live proposal deck and the internal pitch script so the company history matches the account.

Co-authored-by: sarapizzico-hue <sarapizzico-hue@users.noreply.github.com>
</commit_message>
<xml_diff>
--- a/script-dental-muller-pitch.docx
+++ b/script-dental-muller-pitch.docx
@@ -150,7 +150,7 @@
           <w:color w:val="1A1A1A"/>
           <w:sz w:val="22"/>
         </w:rPr>
-        <w:t>Sala cautelosa, 40 anos sem mídia, medo real de gerar demanda que a operação não atende. Tom: respeito pela operação. Continuidade da EE — não venda fria. Preço por último.</w:t>
+        <w:t>Sala cautelosa, 30 anos sem mídia, medo real de gerar demanda que a operação não atende. Tom: respeito pela operação. Continuidade da EE — não venda fria. Preço por último.</w:t>
       </w:r>
     </w:p>
     <w:tbl>
@@ -470,7 +470,9 @@
             <w:pPr>
               <w:spacing w:after="0"/>
             </w:pPr>
-            <w:r/>
+            <w:r>
+              <w:t>FALA  Esta proposta não nasce hoje. Nasce do mapa que a EE já entregou. A Muller tem 30 anos de relacionamento, logística rápida e venda consultiva na Bahia. O próximo ciclo é capturar a demanda técnica que já circula no mercado — no ritmo do estoque e da entrega. Dois produtos, uma lógica: primeiro o comercial aguenta a origem nova. Depois o Growth liga o canal.</w:t>
+            </w:r>
             <w:r>
               <w:rPr>
                 <w:rFonts w:ascii="Calibri" w:hAnsi="Calibri"/>
@@ -479,7 +481,6 @@
                 <w:color w:val="A10F14"/>
                 <w:sz w:val="18"/>
               </w:rPr>
-              <w:t xml:space="preserve">FALA  </w:t>
             </w:r>
             <w:r>
               <w:rPr>
@@ -489,7 +490,6 @@
                 <w:color w:val="1A1A1A"/>
                 <w:sz w:val="22"/>
               </w:rPr>
-              <w:t>Esta proposta não nasce hoje. Nasce do mapa que a EE já entregou. A Muller tem 40 anos de relacionamento, logística rápida e venda consultiva na Bahia. O próximo ciclo é capturar a demanda técnica que já circula no mercado — no ritmo do estoque e da entrega. Dois produtos, uma lógica: primeiro o comercial aguenta a origem nova. Depois o Growth liga o canal.</w:t>
             </w:r>
           </w:p>
         </w:tc>

</xml_diff>